<commit_message>
[FIX] Validacion REPO v1.0
</commit_message>
<xml_diff>
--- a/fuentes/12310176_CF2_DI.docx
+++ b/fuentes/12310176_CF2_DI.docx
@@ -6616,14 +6616,14 @@
               </wp:anchor>
             </w:drawing>
           </mc:Choice>
-          <mc:Fallback>
-            <w:pict>
-              <v:shape w14:anchorId="5D49A0FB" id="Rectángulo: esquinas superiores, una redondeada y la otra cortada 4" o:spid="_x0000_s1026" style="position:absolute;margin-left:34.8pt;margin-top:10.4pt;width:437.5pt;height:31.3pt;z-index:251681792;visibility:visible;mso-wrap-style:square;mso-width-percent:0;mso-wrap-distance-left:9pt;mso-wrap-distance-top:0;mso-wrap-distance-right:9pt;mso-wrap-distance-bottom:0;mso-position-horizontal:absolute;mso-position-horizontal-relative:text;mso-position-vertical:absolute;mso-position-vertical-relative:text;mso-width-percent:0;mso-width-relative:margin;v-text-anchor:middle" coordsize="5556471,397565" o:spt="100" o:gfxdata="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" adj="-11796480,,5400" path="m66262,l5490209,r66262,66262l5556471,397565,,397565,,66262c,29667,29667,,66262,xe" fillcolor="#a5d5e2 [1624]" strokecolor="#40a7c2 [3048]">
-                <v:fill color2="#e4f2f6 [504]" rotate="t" angle="180" colors="0 #9eeaff;22938f #bbefff;1 #e4f9ff" focus="100%" type="gradient"/>
+          <mc:Fallback xmlns:a="http://schemas.openxmlformats.org/drawingml/2006/main" xmlns:pic="http://schemas.openxmlformats.org/drawingml/2006/picture" xmlns:a14="http://schemas.microsoft.com/office/drawing/2010/main">
+            <w:pict w14:anchorId="5441F657">
+              <v:shape id="Rectángulo: esquinas superiores, una redondeada y la otra cortada 4" style="position:absolute;margin-left:34.8pt;margin-top:10.4pt;width:437.5pt;height:31.3pt;z-index:251681792;visibility:visible;mso-wrap-style:square;mso-width-percent:0;mso-wrap-distance-left:9pt;mso-wrap-distance-top:0;mso-wrap-distance-right:9pt;mso-wrap-distance-bottom:0;mso-position-horizontal:absolute;mso-position-horizontal-relative:text;mso-position-vertical:absolute;mso-position-vertical-relative:text;mso-width-percent:0;mso-width-relative:margin;v-text-anchor:middle" coordsize="5556471,397565" o:spid="_x0000_s1026" fillcolor="#a5d5e2 [1624]" strokecolor="#40a7c2 [3048]" o:spt="100" adj="-11796480,,5400" path="m66262,l5490209,r66262,66262l5556471,397565,,397565,,66262c,29667,29667,,66262,xe" o:gfxdata="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" w14:anchorId="5D49A0FB">
+                <v:fill type="gradient" color2="#e4f2f6 [504]" colors="0 #9eeaff;22938f #bbefff;1 #e4f9ff" angle="180" focus="100%" rotate="t"/>
                 <v:stroke joinstyle="miter"/>
-                <v:shadow on="t" color="black" opacity="24903f" origin=",.5" offset="0,.55556mm"/>
+                <v:shadow on="t" color="black" opacity="24903f" offset="0,.55556mm" origin=",.5"/>
                 <v:formulas/>
-                <v:path arrowok="t" o:connecttype="custom" o:connectlocs="66262,0;5490209,0;5556471,66262;5556471,397565;0,397565;0,66262;66262,0" o:connectangles="0,0,0,0,0,0,0" textboxrect="0,0,5556471,397565"/>
+                <v:path textboxrect="0,0,5556471,397565" arrowok="t" o:connecttype="custom" o:connectlocs="66262,0;5490209,0;5556471,66262;5556471,397565;0,397565;0,66262;66262,0" o:connectangles="0,0,0,0,0,0,0"/>
                 <v:textbox>
                   <w:txbxContent>
                     <w:p>
@@ -7372,14 +7372,14 @@
               </wp:anchor>
             </w:drawing>
           </mc:Choice>
-          <mc:Fallback>
-            <w:pict>
-              <v:shape w14:anchorId="150EE44D" id="_x0000_s1027" style="position:absolute;margin-left:46.1pt;margin-top:1.3pt;width:376.8pt;height:77.15pt;z-index:251683840;visibility:visible;mso-wrap-style:square;mso-width-percent:0;mso-height-percent:0;mso-wrap-distance-left:9pt;mso-wrap-distance-top:0;mso-wrap-distance-right:9pt;mso-wrap-distance-bottom:0;mso-position-horizontal:absolute;mso-position-horizontal-relative:text;mso-position-vertical:absolute;mso-position-vertical-relative:text;mso-width-percent:0;mso-height-percent:0;mso-width-relative:margin;mso-height-relative:margin;v-text-anchor:middle" coordsize="4785194,979667" o:spt="100" o:gfxdata="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" adj="-11796480,,5400" path="m163281,l4621913,r163281,163281l4785194,979667,,979667,,163281c,73103,73103,,163281,xe" fillcolor="#a5d5e2 [1624]" strokecolor="#40a7c2 [3048]">
-                <v:fill color2="#e4f2f6 [504]" rotate="t" angle="180" colors="0 #9eeaff;22938f #bbefff;1 #e4f9ff" focus="100%" type="gradient"/>
+          <mc:Fallback xmlns:a="http://schemas.openxmlformats.org/drawingml/2006/main" xmlns:pic="http://schemas.openxmlformats.org/drawingml/2006/picture" xmlns:a14="http://schemas.microsoft.com/office/drawing/2010/main">
+            <w:pict w14:anchorId="60C74389">
+              <v:shape id="_x0000_s1027" style="position:absolute;margin-left:46.1pt;margin-top:1.3pt;width:376.8pt;height:77.15pt;z-index:251683840;visibility:visible;mso-wrap-style:square;mso-width-percent:0;mso-height-percent:0;mso-wrap-distance-left:9pt;mso-wrap-distance-top:0;mso-wrap-distance-right:9pt;mso-wrap-distance-bottom:0;mso-position-horizontal:absolute;mso-position-horizontal-relative:text;mso-position-vertical:absolute;mso-position-vertical-relative:text;mso-width-percent:0;mso-height-percent:0;mso-width-relative:margin;mso-height-relative:margin;v-text-anchor:middle" coordsize="4785194,979667" fillcolor="#a5d5e2 [1624]" strokecolor="#40a7c2 [3048]" o:spt="100" adj="-11796480,,5400" path="m163281,l4621913,r163281,163281l4785194,979667,,979667,,163281c,73103,73103,,163281,xe" o:gfxdata="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" w14:anchorId="150EE44D">
+                <v:fill type="gradient" color2="#e4f2f6 [504]" colors="0 #9eeaff;22938f #bbefff;1 #e4f9ff" angle="180" focus="100%" rotate="t"/>
                 <v:stroke joinstyle="miter"/>
-                <v:shadow on="t" color="black" opacity="24903f" origin=",.5" offset="0,.55556mm"/>
+                <v:shadow on="t" color="black" opacity="24903f" offset="0,.55556mm" origin=",.5"/>
                 <v:formulas/>
-                <v:path arrowok="t" o:connecttype="custom" o:connectlocs="163281,0;4621913,0;4785194,163281;4785194,979667;0,979667;0,163281;163281,0" o:connectangles="0,0,0,0,0,0,0" textboxrect="0,0,4785194,979667"/>
+                <v:path textboxrect="0,0,4785194,979667" arrowok="t" o:connecttype="custom" o:connectlocs="163281,0;4621913,0;4785194,163281;4785194,979667;0,979667;0,163281;163281,0" o:connectangles="0,0,0,0,0,0,0"/>
                 <v:textbox>
                   <w:txbxContent>
                     <w:p>
@@ -9210,11 +9210,11 @@
               </wp:anchor>
             </w:drawing>
           </mc:Choice>
-          <mc:Fallback>
-            <w:pict>
-              <v:oval w14:anchorId="600C1E9D" id="Elipse 3" o:spid="_x0000_s1028" style="position:absolute;margin-left:331.05pt;margin-top:7.5pt;width:28.15pt;height:28.8pt;z-index:251676672;visibility:visible;mso-wrap-style:square;mso-wrap-distance-left:9pt;mso-wrap-distance-top:0;mso-wrap-distance-right:9pt;mso-wrap-distance-bottom:0;mso-position-horizontal:absolute;mso-position-horizontal-relative:text;mso-position-vertical:absolute;mso-position-vertical-relative:text;v-text-anchor:middle" o:gfxdata="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" fillcolor="#a5d5e2 [1624]" strokecolor="#40a7c2 [3048]">
-                <v:fill color2="#e4f2f6 [504]" rotate="t" angle="180" colors="0 #9eeaff;22938f #bbefff;1 #e4f9ff" focus="100%" type="gradient"/>
-                <v:shadow on="t" color="black" opacity="24903f" origin=",.5" offset="0,.55556mm"/>
+          <mc:Fallback xmlns:a="http://schemas.openxmlformats.org/drawingml/2006/main" xmlns:pic="http://schemas.openxmlformats.org/drawingml/2006/picture" xmlns:a14="http://schemas.microsoft.com/office/drawing/2010/main">
+            <w:pict w14:anchorId="11ED487E">
+              <v:oval id="Elipse 3" style="position:absolute;margin-left:331.05pt;margin-top:7.5pt;width:28.15pt;height:28.8pt;z-index:251676672;visibility:visible;mso-wrap-style:square;mso-wrap-distance-left:9pt;mso-wrap-distance-top:0;mso-wrap-distance-right:9pt;mso-wrap-distance-bottom:0;mso-position-horizontal:absolute;mso-position-horizontal-relative:text;mso-position-vertical:absolute;mso-position-vertical-relative:text;v-text-anchor:middle" o:spid="_x0000_s1028" fillcolor="#a5d5e2 [1624]" strokecolor="#40a7c2 [3048]" w14:anchorId="600C1E9D" o:gfxdata="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">
+                <v:fill type="gradient" color2="#e4f2f6 [504]" colors="0 #9eeaff;22938f #bbefff;1 #e4f9ff" angle="180" focus="100%" rotate="t"/>
+                <v:shadow on="t" color="black" opacity="24903f" offset="0,.55556mm" origin=",.5"/>
                 <v:textbox>
                   <w:txbxContent>
                     <w:p>
@@ -9340,11 +9340,11 @@
               </wp:anchor>
             </w:drawing>
           </mc:Choice>
-          <mc:Fallback>
-            <w:pict>
-              <v:oval w14:anchorId="21483FA6" id="_x0000_s1029" style="position:absolute;margin-left:-23.05pt;margin-top:3.9pt;width:28.15pt;height:28.8pt;z-index:251674624;visibility:visible;mso-wrap-style:square;mso-wrap-distance-left:9pt;mso-wrap-distance-top:0;mso-wrap-distance-right:9pt;mso-wrap-distance-bottom:0;mso-position-horizontal:right;mso-position-horizontal-relative:margin;mso-position-vertical:absolute;mso-position-vertical-relative:text;v-text-anchor:middle" o:gfxdata="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" fillcolor="#a5d5e2 [1624]" strokecolor="#40a7c2 [3048]">
-                <v:fill color2="#e4f2f6 [504]" rotate="t" angle="180" colors="0 #9eeaff;22938f #bbefff;1 #e4f9ff" focus="100%" type="gradient"/>
-                <v:shadow on="t" color="black" opacity="24903f" origin=",.5" offset="0,.55556mm"/>
+          <mc:Fallback xmlns:a="http://schemas.openxmlformats.org/drawingml/2006/main" xmlns:pic="http://schemas.openxmlformats.org/drawingml/2006/picture" xmlns:a14="http://schemas.microsoft.com/office/drawing/2010/main">
+            <w:pict w14:anchorId="155F6767">
+              <v:oval id="_x0000_s1029" style="position:absolute;margin-left:-23.05pt;margin-top:3.9pt;width:28.15pt;height:28.8pt;z-index:251674624;visibility:visible;mso-wrap-style:square;mso-wrap-distance-left:9pt;mso-wrap-distance-top:0;mso-wrap-distance-right:9pt;mso-wrap-distance-bottom:0;mso-position-horizontal:right;mso-position-horizontal-relative:margin;mso-position-vertical:absolute;mso-position-vertical-relative:text;v-text-anchor:middle" fillcolor="#a5d5e2 [1624]" strokecolor="#40a7c2 [3048]" w14:anchorId="21483FA6" o:gfxdata="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">
+                <v:fill type="gradient" color2="#e4f2f6 [504]" colors="0 #9eeaff;22938f #bbefff;1 #e4f9ff" angle="180" focus="100%" rotate="t"/>
+                <v:shadow on="t" color="black" opacity="24903f" offset="0,.55556mm" origin=",.5"/>
                 <v:textbox>
                   <w:txbxContent>
                     <w:p>
@@ -9460,11 +9460,11 @@
               </wp:anchor>
             </w:drawing>
           </mc:Choice>
-          <mc:Fallback>
-            <w:pict>
-              <v:oval w14:anchorId="3999A917" id="_x0000_s1030" style="position:absolute;margin-left:350.7pt;margin-top:16.9pt;width:28.15pt;height:28.8pt;z-index:251672576;visibility:visible;mso-wrap-style:square;mso-wrap-distance-left:9pt;mso-wrap-distance-top:0;mso-wrap-distance-right:9pt;mso-wrap-distance-bottom:0;mso-position-horizontal:absolute;mso-position-horizontal-relative:text;mso-position-vertical:absolute;mso-position-vertical-relative:text;v-text-anchor:middle" o:gfxdata="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" fillcolor="#a5d5e2 [1624]" strokecolor="#40a7c2 [3048]">
-                <v:fill color2="#e4f2f6 [504]" rotate="t" angle="180" colors="0 #9eeaff;22938f #bbefff;1 #e4f9ff" focus="100%" type="gradient"/>
-                <v:shadow on="t" color="black" opacity="24903f" origin=",.5" offset="0,.55556mm"/>
+          <mc:Fallback xmlns:a="http://schemas.openxmlformats.org/drawingml/2006/main" xmlns:pic="http://schemas.openxmlformats.org/drawingml/2006/picture" xmlns:a14="http://schemas.microsoft.com/office/drawing/2010/main">
+            <w:pict w14:anchorId="0DF9A395">
+              <v:oval id="_x0000_s1030" style="position:absolute;margin-left:350.7pt;margin-top:16.9pt;width:28.15pt;height:28.8pt;z-index:251672576;visibility:visible;mso-wrap-style:square;mso-wrap-distance-left:9pt;mso-wrap-distance-top:0;mso-wrap-distance-right:9pt;mso-wrap-distance-bottom:0;mso-position-horizontal:absolute;mso-position-horizontal-relative:text;mso-position-vertical:absolute;mso-position-vertical-relative:text;v-text-anchor:middle" fillcolor="#a5d5e2 [1624]" strokecolor="#40a7c2 [3048]" w14:anchorId="3999A917" o:gfxdata="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">
+                <v:fill type="gradient" color2="#e4f2f6 [504]" colors="0 #9eeaff;22938f #bbefff;1 #e4f9ff" angle="180" focus="100%" rotate="t"/>
+                <v:shadow on="t" color="black" opacity="24903f" offset="0,.55556mm" origin=",.5"/>
                 <v:textbox>
                   <w:txbxContent>
                     <w:p>
@@ -9579,11 +9579,11 @@
               </wp:anchor>
             </w:drawing>
           </mc:Choice>
-          <mc:Fallback>
-            <w:pict>
-              <v:oval w14:anchorId="2E615345" id="_x0000_s1031" style="position:absolute;margin-left:275.3pt;margin-top:8.85pt;width:28.15pt;height:28.8pt;z-index:251678720;visibility:visible;mso-wrap-style:square;mso-wrap-distance-left:9pt;mso-wrap-distance-top:0;mso-wrap-distance-right:9pt;mso-wrap-distance-bottom:0;mso-position-horizontal:absolute;mso-position-horizontal-relative:text;mso-position-vertical:absolute;mso-position-vertical-relative:text;v-text-anchor:middle" o:gfxdata="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" fillcolor="#a5d5e2 [1624]" strokecolor="#40a7c2 [3048]">
-                <v:fill color2="#e4f2f6 [504]" rotate="t" angle="180" colors="0 #9eeaff;22938f #bbefff;1 #e4f9ff" focus="100%" type="gradient"/>
-                <v:shadow on="t" color="black" opacity="24903f" origin=",.5" offset="0,.55556mm"/>
+          <mc:Fallback xmlns:a="http://schemas.openxmlformats.org/drawingml/2006/main" xmlns:pic="http://schemas.openxmlformats.org/drawingml/2006/picture" xmlns:a14="http://schemas.microsoft.com/office/drawing/2010/main">
+            <w:pict w14:anchorId="2CF5A1AD">
+              <v:oval id="_x0000_s1031" style="position:absolute;margin-left:275.3pt;margin-top:8.85pt;width:28.15pt;height:28.8pt;z-index:251678720;visibility:visible;mso-wrap-style:square;mso-wrap-distance-left:9pt;mso-wrap-distance-top:0;mso-wrap-distance-right:9pt;mso-wrap-distance-bottom:0;mso-position-horizontal:absolute;mso-position-horizontal-relative:text;mso-position-vertical:absolute;mso-position-vertical-relative:text;v-text-anchor:middle" fillcolor="#a5d5e2 [1624]" strokecolor="#40a7c2 [3048]" w14:anchorId="2E615345" o:gfxdata="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">
+                <v:fill type="gradient" color2="#e4f2f6 [504]" colors="0 #9eeaff;22938f #bbefff;1 #e4f9ff" angle="180" focus="100%" rotate="t"/>
+                <v:shadow on="t" color="black" opacity="24903f" offset="0,.55556mm" origin=",.5"/>
                 <v:textbox>
                   <w:txbxContent>
                     <w:p>
@@ -9712,11 +9712,11 @@
               </wp:anchor>
             </w:drawing>
           </mc:Choice>
-          <mc:Fallback>
-            <w:pict>
-              <v:oval w14:anchorId="5780CFE5" id="_x0000_s1032" style="position:absolute;margin-left:400.45pt;margin-top:7.65pt;width:28.15pt;height:29.9pt;z-index:251680768;visibility:visible;mso-wrap-style:square;mso-height-percent:0;mso-wrap-distance-left:9pt;mso-wrap-distance-top:0;mso-wrap-distance-right:9pt;mso-wrap-distance-bottom:0;mso-position-horizontal:absolute;mso-position-horizontal-relative:text;mso-position-vertical:absolute;mso-position-vertical-relative:text;mso-height-percent:0;mso-height-relative:margin;v-text-anchor:middle" o:gfxdata="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" fillcolor="#a5d5e2 [1624]" strokecolor="#40a7c2 [3048]">
-                <v:fill color2="#e4f2f6 [504]" rotate="t" angle="180" colors="0 #9eeaff;22938f #bbefff;1 #e4f9ff" focus="100%" type="gradient"/>
-                <v:shadow on="t" color="black" opacity="24903f" origin=",.5" offset="0,.55556mm"/>
+          <mc:Fallback xmlns:a="http://schemas.openxmlformats.org/drawingml/2006/main" xmlns:pic="http://schemas.openxmlformats.org/drawingml/2006/picture" xmlns:a14="http://schemas.microsoft.com/office/drawing/2010/main">
+            <w:pict w14:anchorId="4D8F60D5">
+              <v:oval id="_x0000_s1032" style="position:absolute;margin-left:400.45pt;margin-top:7.65pt;width:28.15pt;height:29.9pt;z-index:251680768;visibility:visible;mso-wrap-style:square;mso-height-percent:0;mso-wrap-distance-left:9pt;mso-wrap-distance-top:0;mso-wrap-distance-right:9pt;mso-wrap-distance-bottom:0;mso-position-horizontal:absolute;mso-position-horizontal-relative:text;mso-position-vertical:absolute;mso-position-vertical-relative:text;mso-height-percent:0;mso-height-relative:margin;v-text-anchor:middle" fillcolor="#a5d5e2 [1624]" strokecolor="#40a7c2 [3048]" w14:anchorId="5780CFE5" o:gfxdata="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">
+                <v:fill type="gradient" color2="#e4f2f6 [504]" colors="0 #9eeaff;22938f #bbefff;1 #e4f9ff" angle="180" focus="100%" rotate="t"/>
+                <v:shadow on="t" color="black" opacity="24903f" offset="0,.55556mm" origin=",.5"/>
                 <v:textbox>
                   <w:txbxContent>
                     <w:p>
@@ -10117,25 +10117,12 @@
       </w:pPr>
     </w:p>
     <w:p>
-      <w:pPr>
-        <w:pStyle w:val="Normal0"/>
-        <w:rPr>
-          <w:color w:val="948A54"/>
-          <w:sz w:val="20"/>
-          <w:szCs w:val="20"/>
-        </w:rPr>
-      </w:pPr>
-      <w:r>
-        <w:rPr>
-          <w:color w:val="948A54"/>
-          <w:sz w:val="20"/>
-          <w:szCs w:val="20"/>
-        </w:rPr>
+      <w:r>
         <w:drawing>
-          <wp:inline distT="0" distB="0" distL="0" distR="0" wp14:anchorId="14DE7FA9" wp14:editId="5D25EB4F">
-            <wp:extent cx="6332220" cy="3583305"/>
-            <wp:effectExtent l="0" t="0" r="0" b="0"/>
-            <wp:docPr id="331217577" name="Imagen 1" descr="Diagrama&#10;&#10;El contenido generado por IA puede ser incorrecto."/>
+          <wp:inline distT="0" distB="0" distL="0" distR="0" wp14:anchorId="35076082" wp14:editId="50C46225">
+            <wp:extent cx="6332220" cy="3713480"/>
+            <wp:effectExtent l="0" t="0" r="0" b="1270"/>
+            <wp:docPr id="1967532300" name="Imagen 1" descr="Diagrama&#10;&#10;El contenido generado por IA puede ser incorrecto."/>
             <wp:cNvGraphicFramePr>
               <a:graphicFrameLocks xmlns:a="http://schemas.openxmlformats.org/drawingml/2006/main" noChangeAspect="1"/>
             </wp:cNvGraphicFramePr>
@@ -10143,7 +10130,7 @@
               <a:graphicData uri="http://schemas.openxmlformats.org/drawingml/2006/picture">
                 <pic:pic xmlns:pic="http://schemas.openxmlformats.org/drawingml/2006/picture">
                   <pic:nvPicPr>
-                    <pic:cNvPr id="331217577" name="Imagen 1" descr="Diagrama&#10;&#10;El contenido generado por IA puede ser incorrecto."/>
+                    <pic:cNvPr id="1967532300" name="Imagen 1" descr="Diagrama&#10;&#10;El contenido generado por IA puede ser incorrecto."/>
                     <pic:cNvPicPr/>
                   </pic:nvPicPr>
                   <pic:blipFill>
@@ -10155,7 +10142,7 @@
                   <pic:spPr>
                     <a:xfrm>
                       <a:off x="0" y="0"/>
-                      <a:ext cx="6332220" cy="3583305"/>
+                      <a:ext cx="6332220" cy="3713480"/>
                     </a:xfrm>
                     <a:prstGeom prst="rect">
                       <a:avLst/>
@@ -10561,6 +10548,16 @@
               </w:rPr>
               <w:t>El presupuesto como herramienta clave para la gestión financiera personal</w:t>
             </w:r>
+            <w:r>
+              <w:rPr>
+                <w:b w:val="0"/>
+                <w:bCs/>
+                <w:sz w:val="20"/>
+                <w:szCs w:val="20"/>
+                <w:lang w:eastAsia="es-CO"/>
+              </w:rPr>
+              <w:t>.</w:t>
+            </w:r>
           </w:p>
           <w:p>
             <w:pPr>
@@ -10640,12 +10637,16 @@
             <w:pPr>
               <w:pStyle w:val="Normal0"/>
               <w:rPr>
+                <w:b w:val="0"/>
+                <w:bCs/>
                 <w:sz w:val="20"/>
                 <w:szCs w:val="20"/>
               </w:rPr>
             </w:pPr>
             <w:r>
               <w:rPr>
+                <w:b w:val="0"/>
+                <w:bCs/>
                 <w:sz w:val="20"/>
                 <w:szCs w:val="20"/>
               </w:rPr>
@@ -10772,6 +10773,16 @@
               </w:rPr>
               <w:t>El presupuesto como herramienta clave para la gestión financiera personal</w:t>
             </w:r>
+            <w:r>
+              <w:rPr>
+                <w:b w:val="0"/>
+                <w:bCs/>
+                <w:sz w:val="20"/>
+                <w:szCs w:val="20"/>
+                <w:lang w:eastAsia="es-CO"/>
+              </w:rPr>
+              <w:t>.</w:t>
+            </w:r>
           </w:p>
           <w:p>
             <w:pPr>
@@ -10861,12 +10872,16 @@
             <w:pPr>
               <w:pStyle w:val="Normal0"/>
               <w:rPr>
+                <w:b w:val="0"/>
+                <w:bCs/>
                 <w:sz w:val="20"/>
                 <w:szCs w:val="20"/>
               </w:rPr>
             </w:pPr>
             <w:r>
               <w:rPr>
+                <w:b w:val="0"/>
+                <w:bCs/>
                 <w:sz w:val="20"/>
                 <w:szCs w:val="20"/>
               </w:rPr>
@@ -12129,6 +12144,15 @@
           <w:szCs w:val="20"/>
         </w:rPr>
         <w:t>(2005)</w:t>
+      </w:r>
+      <w:r>
+        <w:rPr>
+          <w:rFonts w:ascii="Arial" w:hAnsi="Arial" w:cs="Arial"/>
+          <w:color w:val="404041"/>
+          <w:sz w:val="20"/>
+          <w:szCs w:val="20"/>
+        </w:rPr>
+        <w:t>.</w:t>
       </w:r>
       <w:r>
         <w:rPr>
@@ -22911,6 +22935,7 @@
   <w:style w:type="character" w:default="1" w:styleId="Fuentedeprrafopredeter">
     <w:name w:val="Default Paragraph Font"/>
     <w:uiPriority w:val="1"/>
+    <w:semiHidden/>
     <w:unhideWhenUsed/>
   </w:style>
   <w:style w:type="table" w:default="1" w:styleId="Tablanormal">
@@ -24594,36 +24619,26 @@
 </file>
 
 <file path=customXml/item1.xml><?xml version="1.0" encoding="utf-8"?>
-<go:gDocsCustomXmlDataStorage xmlns:go="http://customooxmlschemas.google.com/" xmlns:r="http://schemas.openxmlformats.org/officeDocument/2006/relationships">
-  <go:docsCustomData xmlns:go="http://customooxmlschemas.google.com/" roundtripDataSignature="AMtx7mh3w1sXrKwdjzYCxjbwPkf7wsIk5w==">AMUW2mWhRc/xLonLdtoI8dz4BVu2GREgE7++Eme5Ko+W5/2G+QfXPKxV7NwLPPaJ77IM2LrlHDguxVZnDKcg4iQIvJIe+zJ9DBWjUaWFI+z0k4HbdiCFsJo=</go:docsCustomData>
-</go:gDocsCustomXmlDataStorage>
-</file>
-
-<file path=customXml/item2.xml><?xml version="1.0" encoding="utf-8"?>
-<ct:contentTypeSchema xmlns:ct="http://schemas.microsoft.com/office/2006/metadata/contentType" xmlns:ma="http://schemas.microsoft.com/office/2006/metadata/properties/metaAttributes" ct:_="" ma:_="" ma:contentTypeName="Documento" ma:contentTypeID="0x01010049282E1EDBE9234EA9E6D38F720E265F" ma:contentTypeVersion="15" ma:contentTypeDescription="Crear nuevo documento." ma:contentTypeScope="" ma:versionID="b31c7aa9eaf043a08b87120b3c4916e3">
-  <xsd:schema xmlns:xsd="http://www.w3.org/2001/XMLSchema" xmlns:xs="http://www.w3.org/2001/XMLSchema" xmlns:p="http://schemas.microsoft.com/office/2006/metadata/properties" xmlns:ns2="cb45339b-ced9-4d0d-8f64-77573914d53b" xmlns:ns3="43a3ca16-9c26-4813-b83f-4aec9927b43f" targetNamespace="http://schemas.microsoft.com/office/2006/metadata/properties" ma:root="true" ma:fieldsID="3533d065b04d75c457075bc55f1f5315" ns2:_="" ns3:_="">
-    <xsd:import namespace="cb45339b-ced9-4d0d-8f64-77573914d53b"/>
-    <xsd:import namespace="43a3ca16-9c26-4813-b83f-4aec9927b43f"/>
+<ct:contentTypeSchema xmlns:ct="http://schemas.microsoft.com/office/2006/metadata/contentType" xmlns:ma="http://schemas.microsoft.com/office/2006/metadata/properties/metaAttributes" ct:_="" ma:_="" ma:contentTypeName="Documento" ma:contentTypeID="0x0101005D7421CBAB376F47AC1876466873BE0C" ma:contentTypeVersion="11" ma:contentTypeDescription="Crear nuevo documento." ma:contentTypeScope="" ma:versionID="2b4f891a1a5ad88e3e621500c8553ae4">
+  <xsd:schema xmlns:xsd="http://www.w3.org/2001/XMLSchema" xmlns:xs="http://www.w3.org/2001/XMLSchema" xmlns:p="http://schemas.microsoft.com/office/2006/metadata/properties" xmlns:ns2="55abea07-cd72-4a95-add0-1082a24cf9e9" xmlns:ns3="285d351f-f218-493a-825f-85a9dfbde315" targetNamespace="http://schemas.microsoft.com/office/2006/metadata/properties" ma:root="true" ma:fieldsID="4883b2e7c543eac85f1b7e21127c6f20" ns2:_="" ns3:_="">
+    <xsd:import namespace="55abea07-cd72-4a95-add0-1082a24cf9e9"/>
+    <xsd:import namespace="285d351f-f218-493a-825f-85a9dfbde315"/>
     <xsd:element name="properties">
       <xsd:complexType>
         <xsd:sequence>
           <xsd:element name="documentManagement">
             <xsd:complexType>
               <xsd:all>
-                <xsd:element ref="ns2:SharedWithUsers" minOccurs="0"/>
-                <xsd:element ref="ns2:SharedWithDetails" minOccurs="0"/>
-                <xsd:element ref="ns3:MediaServiceMetadata" minOccurs="0"/>
-                <xsd:element ref="ns3:MediaServiceFastMetadata" minOccurs="0"/>
-                <xsd:element ref="ns3:MediaServiceDateTaken" minOccurs="0"/>
-                <xsd:element ref="ns3:MediaServiceObjectDetectorVersions" minOccurs="0"/>
-                <xsd:element ref="ns3:MediaLengthInSeconds" minOccurs="0"/>
-                <xsd:element ref="ns3:MediaServiceLocation" minOccurs="0"/>
-                <xsd:element ref="ns3:MediaServiceGenerationTime" minOccurs="0"/>
-                <xsd:element ref="ns3:MediaServiceEventHashCode" minOccurs="0"/>
-                <xsd:element ref="ns3:lcf76f155ced4ddcb4097134ff3c332f" minOccurs="0"/>
-                <xsd:element ref="ns2:TaxCatchAll" minOccurs="0"/>
-                <xsd:element ref="ns3:MediaServiceOCR" minOccurs="0"/>
-                <xsd:element ref="ns3:MediaServiceSearchProperties" minOccurs="0"/>
+                <xsd:element ref="ns2:MediaServiceMetadata" minOccurs="0"/>
+                <xsd:element ref="ns2:MediaServiceFastMetadata" minOccurs="0"/>
+                <xsd:element ref="ns2:MediaServiceSearchProperties" minOccurs="0"/>
+                <xsd:element ref="ns2:MediaServiceDateTaken" minOccurs="0"/>
+                <xsd:element ref="ns2:lcf76f155ced4ddcb4097134ff3c332f" minOccurs="0"/>
+                <xsd:element ref="ns3:TaxCatchAll" minOccurs="0"/>
+                <xsd:element ref="ns2:MediaServiceOCR" minOccurs="0"/>
+                <xsd:element ref="ns2:MediaServiceGenerationTime" minOccurs="0"/>
+                <xsd:element ref="ns2:MediaServiceEventHashCode" minOccurs="0"/>
+                <xsd:element ref="ns2:MediaLengthInSeconds" minOccurs="0"/>
               </xsd:all>
             </xsd:complexType>
           </xsd:element>
@@ -24631,78 +24646,41 @@
       </xsd:complexType>
     </xsd:element>
   </xsd:schema>
-  <xsd:schema xmlns:xsd="http://www.w3.org/2001/XMLSchema" xmlns:xs="http://www.w3.org/2001/XMLSchema" xmlns:dms="http://schemas.microsoft.com/office/2006/documentManagement/types" xmlns:pc="http://schemas.microsoft.com/office/infopath/2007/PartnerControls" targetNamespace="cb45339b-ced9-4d0d-8f64-77573914d53b" elementFormDefault="qualified">
+  <xsd:schema xmlns:xsd="http://www.w3.org/2001/XMLSchema" xmlns:xs="http://www.w3.org/2001/XMLSchema" xmlns:dms="http://schemas.microsoft.com/office/2006/documentManagement/types" xmlns:pc="http://schemas.microsoft.com/office/infopath/2007/PartnerControls" targetNamespace="55abea07-cd72-4a95-add0-1082a24cf9e9" elementFormDefault="qualified">
     <xsd:import namespace="http://schemas.microsoft.com/office/2006/documentManagement/types"/>
     <xsd:import namespace="http://schemas.microsoft.com/office/infopath/2007/PartnerControls"/>
-    <xsd:element name="SharedWithUsers" ma:index="8" nillable="true" ma:displayName="Compartido con" ma:internalName="SharedWithUsers" ma:readOnly="true">
+    <xsd:element name="MediaServiceMetadata" ma:index="8" nillable="true" ma:displayName="MediaServiceMetadata" ma:hidden="true" ma:internalName="MediaServiceMetadata" ma:readOnly="true">
+      <xsd:simpleType>
+        <xsd:restriction base="dms:Note"/>
+      </xsd:simpleType>
+    </xsd:element>
+    <xsd:element name="MediaServiceFastMetadata" ma:index="9" nillable="true" ma:displayName="MediaServiceFastMetadata" ma:hidden="true" ma:internalName="MediaServiceFastMetadata" ma:readOnly="true">
+      <xsd:simpleType>
+        <xsd:restriction base="dms:Note"/>
+      </xsd:simpleType>
+    </xsd:element>
+    <xsd:element name="MediaServiceSearchProperties" ma:index="10" nillable="true" ma:displayName="MediaServiceSearchProperties" ma:hidden="true" ma:internalName="MediaServiceSearchProperties" ma:readOnly="true">
+      <xsd:simpleType>
+        <xsd:restriction base="dms:Note"/>
+      </xsd:simpleType>
+    </xsd:element>
+    <xsd:element name="MediaServiceDateTaken" ma:index="11" nillable="true" ma:displayName="MediaServiceDateTaken" ma:hidden="true" ma:indexed="true" ma:internalName="MediaServiceDateTaken" ma:readOnly="true">
+      <xsd:simpleType>
+        <xsd:restriction base="dms:Text"/>
+      </xsd:simpleType>
+    </xsd:element>
+    <xsd:element name="lcf76f155ced4ddcb4097134ff3c332f" ma:index="13" nillable="true" ma:taxonomy="true" ma:internalName="lcf76f155ced4ddcb4097134ff3c332f" ma:taxonomyFieldName="MediaServiceImageTags" ma:displayName="Etiquetas de imagen" ma:readOnly="false" ma:fieldId="{5cf76f15-5ced-4ddc-b409-7134ff3c332f}" ma:taxonomyMulti="true" ma:sspId="d33c8c81-5745-4931-bcc4-c2aeafe86780" ma:termSetId="09814cd3-568e-fe90-9814-8d621ff8fb84" ma:anchorId="fba54fb3-c3e1-fe81-a776-ca4b69148c4d" ma:open="true" ma:isKeyword="false">
       <xsd:complexType>
-        <xsd:complexContent>
-          <xsd:extension base="dms:UserMulti">
-            <xsd:sequence>
-              <xsd:element name="UserInfo" minOccurs="0" maxOccurs="unbounded">
-                <xsd:complexType>
-                  <xsd:sequence>
-                    <xsd:element name="DisplayName" type="xsd:string" minOccurs="0"/>
-                    <xsd:element name="AccountId" type="dms:UserId" minOccurs="0" nillable="true"/>
-                    <xsd:element name="AccountType" type="xsd:string" minOccurs="0"/>
-                  </xsd:sequence>
-                </xsd:complexType>
-              </xsd:element>
-            </xsd:sequence>
-          </xsd:extension>
-        </xsd:complexContent>
+        <xsd:sequence>
+          <xsd:element ref="pc:Terms" minOccurs="0" maxOccurs="1"/>
+        </xsd:sequence>
       </xsd:complexType>
     </xsd:element>
-    <xsd:element name="SharedWithDetails" ma:index="9" nillable="true" ma:displayName="Detalles de uso compartido" ma:internalName="SharedWithDetails" ma:readOnly="true">
+    <xsd:element name="MediaServiceOCR" ma:index="15" nillable="true" ma:displayName="Extracted Text" ma:internalName="MediaServiceOCR" ma:readOnly="true">
       <xsd:simpleType>
         <xsd:restriction base="dms:Note">
           <xsd:maxLength value="255"/>
         </xsd:restriction>
-      </xsd:simpleType>
-    </xsd:element>
-    <xsd:element name="TaxCatchAll" ma:index="20" nillable="true" ma:displayName="Taxonomy Catch All Column" ma:hidden="true" ma:list="{2f40a149-578b-41a1-8845-c88bc1831770}" ma:internalName="TaxCatchAll" ma:showField="CatchAllData" ma:web="cb45339b-ced9-4d0d-8f64-77573914d53b">
-      <xsd:complexType>
-        <xsd:complexContent>
-          <xsd:extension base="dms:MultiChoiceLookup">
-            <xsd:sequence>
-              <xsd:element name="Value" type="dms:Lookup" maxOccurs="unbounded" minOccurs="0" nillable="true"/>
-            </xsd:sequence>
-          </xsd:extension>
-        </xsd:complexContent>
-      </xsd:complexType>
-    </xsd:element>
-  </xsd:schema>
-  <xsd:schema xmlns:xsd="http://www.w3.org/2001/XMLSchema" xmlns:xs="http://www.w3.org/2001/XMLSchema" xmlns:dms="http://schemas.microsoft.com/office/2006/documentManagement/types" xmlns:pc="http://schemas.microsoft.com/office/infopath/2007/PartnerControls" targetNamespace="43a3ca16-9c26-4813-b83f-4aec9927b43f" elementFormDefault="qualified">
-    <xsd:import namespace="http://schemas.microsoft.com/office/2006/documentManagement/types"/>
-    <xsd:import namespace="http://schemas.microsoft.com/office/infopath/2007/PartnerControls"/>
-    <xsd:element name="MediaServiceMetadata" ma:index="10" nillable="true" ma:displayName="MediaServiceMetadata" ma:hidden="true" ma:internalName="MediaServiceMetadata" ma:readOnly="true">
-      <xsd:simpleType>
-        <xsd:restriction base="dms:Note"/>
-      </xsd:simpleType>
-    </xsd:element>
-    <xsd:element name="MediaServiceFastMetadata" ma:index="11" nillable="true" ma:displayName="MediaServiceFastMetadata" ma:hidden="true" ma:internalName="MediaServiceFastMetadata" ma:readOnly="true">
-      <xsd:simpleType>
-        <xsd:restriction base="dms:Note"/>
-      </xsd:simpleType>
-    </xsd:element>
-    <xsd:element name="MediaServiceDateTaken" ma:index="12" nillable="true" ma:displayName="MediaServiceDateTaken" ma:hidden="true" ma:indexed="true" ma:internalName="MediaServiceDateTaken" ma:readOnly="true">
-      <xsd:simpleType>
-        <xsd:restriction base="dms:Text"/>
-      </xsd:simpleType>
-    </xsd:element>
-    <xsd:element name="MediaServiceObjectDetectorVersions" ma:index="13" nillable="true" ma:displayName="MediaServiceObjectDetectorVersions" ma:hidden="true" ma:indexed="true" ma:internalName="MediaServiceObjectDetectorVersions" ma:readOnly="true">
-      <xsd:simpleType>
-        <xsd:restriction base="dms:Text"/>
-      </xsd:simpleType>
-    </xsd:element>
-    <xsd:element name="MediaLengthInSeconds" ma:index="14" nillable="true" ma:displayName="MediaLengthInSeconds" ma:hidden="true" ma:internalName="MediaLengthInSeconds" ma:readOnly="true">
-      <xsd:simpleType>
-        <xsd:restriction base="dms:Unknown"/>
-      </xsd:simpleType>
-    </xsd:element>
-    <xsd:element name="MediaServiceLocation" ma:index="15" nillable="true" ma:displayName="Location" ma:indexed="true" ma:internalName="MediaServiceLocation" ma:readOnly="true">
-      <xsd:simpleType>
-        <xsd:restriction base="dms:Text"/>
       </xsd:simpleType>
     </xsd:element>
     <xsd:element name="MediaServiceGenerationTime" ma:index="16" nillable="true" ma:displayName="MediaServiceGenerationTime" ma:hidden="true" ma:internalName="MediaServiceGenerationTime" ma:readOnly="true">
@@ -24715,24 +24693,25 @@
         <xsd:restriction base="dms:Text"/>
       </xsd:simpleType>
     </xsd:element>
-    <xsd:element name="lcf76f155ced4ddcb4097134ff3c332f" ma:index="19" nillable="true" ma:taxonomy="true" ma:internalName="lcf76f155ced4ddcb4097134ff3c332f" ma:taxonomyFieldName="MediaServiceImageTags" ma:displayName="Etiquetas de imagen" ma:readOnly="false" ma:fieldId="{5cf76f15-5ced-4ddc-b409-7134ff3c332f}" ma:taxonomyMulti="true" ma:sspId="d33c8c81-5745-4931-bcc4-c2aeafe86780" ma:termSetId="09814cd3-568e-fe90-9814-8d621ff8fb84" ma:anchorId="fba54fb3-c3e1-fe81-a776-ca4b69148c4d" ma:open="true" ma:isKeyword="false">
-      <xsd:complexType>
-        <xsd:sequence>
-          <xsd:element ref="pc:Terms" minOccurs="0" maxOccurs="1"/>
-        </xsd:sequence>
-      </xsd:complexType>
-    </xsd:element>
-    <xsd:element name="MediaServiceOCR" ma:index="21" nillable="true" ma:displayName="Extracted Text" ma:internalName="MediaServiceOCR" ma:readOnly="true">
+    <xsd:element name="MediaLengthInSeconds" ma:index="18" nillable="true" ma:displayName="MediaLengthInSeconds" ma:hidden="true" ma:internalName="MediaLengthInSeconds" ma:readOnly="true">
       <xsd:simpleType>
-        <xsd:restriction base="dms:Note">
-          <xsd:maxLength value="255"/>
-        </xsd:restriction>
+        <xsd:restriction base="dms:Unknown"/>
       </xsd:simpleType>
     </xsd:element>
-    <xsd:element name="MediaServiceSearchProperties" ma:index="22" nillable="true" ma:displayName="MediaServiceSearchProperties" ma:hidden="true" ma:internalName="MediaServiceSearchProperties" ma:readOnly="true">
-      <xsd:simpleType>
-        <xsd:restriction base="dms:Note"/>
-      </xsd:simpleType>
+  </xsd:schema>
+  <xsd:schema xmlns:xsd="http://www.w3.org/2001/XMLSchema" xmlns:xs="http://www.w3.org/2001/XMLSchema" xmlns:dms="http://schemas.microsoft.com/office/2006/documentManagement/types" xmlns:pc="http://schemas.microsoft.com/office/infopath/2007/PartnerControls" targetNamespace="285d351f-f218-493a-825f-85a9dfbde315" elementFormDefault="qualified">
+    <xsd:import namespace="http://schemas.microsoft.com/office/2006/documentManagement/types"/>
+    <xsd:import namespace="http://schemas.microsoft.com/office/infopath/2007/PartnerControls"/>
+    <xsd:element name="TaxCatchAll" ma:index="14" nillable="true" ma:displayName="Taxonomy Catch All Column" ma:hidden="true" ma:list="{5d57ac59-ec13-4ab6-8bf8-a162ea89df9b}" ma:internalName="TaxCatchAll" ma:showField="CatchAllData" ma:web="285d351f-f218-493a-825f-85a9dfbde315">
+      <xsd:complexType>
+        <xsd:complexContent>
+          <xsd:extension base="dms:MultiChoiceLookup">
+            <xsd:sequence>
+              <xsd:element name="Value" type="dms:Lookup" maxOccurs="unbounded" minOccurs="0" nillable="true"/>
+            </xsd:sequence>
+          </xsd:extension>
+        </xsd:complexContent>
+      </xsd:complexType>
     </xsd:element>
   </xsd:schema>
   <xsd:schema xmlns="http://schemas.openxmlformats.org/package/2006/metadata/core-properties" xmlns:xsd="http://www.w3.org/2001/XMLSchema" xmlns:xsi="http://www.w3.org/2001/XMLSchema-instance" xmlns:dc="http://purl.org/dc/elements/1.1/" xmlns:dcterms="http://purl.org/dc/terms/" xmlns:odoc="http://schemas.microsoft.com/internal/obd" targetNamespace="http://schemas.openxmlformats.org/package/2006/metadata/core-properties" elementFormDefault="qualified" attributeFormDefault="unqualified" blockDefault="#all">
@@ -24834,7 +24813,7 @@
 </ct:contentTypeSchema>
 </file>
 
-<file path=customXml/item3.xml><?xml version="1.0" encoding="utf-8"?>
+<file path=customXml/item2.xml><?xml version="1.0" encoding="utf-8"?>
 <?mso-contentType ?>
 <FormTemplates xmlns="http://schemas.microsoft.com/sharepoint/v3/contenttype/forms">
   <Display>DocumentLibraryForm</Display>
@@ -24843,31 +24822,28 @@
 </FormTemplates>
 </file>
 
-<file path=customXml/item4.xml><?xml version="1.0" encoding="utf-8"?>
+<file path=customXml/item3.xml><?xml version="1.0" encoding="utf-8"?>
 <p:properties xmlns:p="http://schemas.microsoft.com/office/2006/metadata/properties" xmlns:xsi="http://www.w3.org/2001/XMLSchema-instance" xmlns:pc="http://schemas.microsoft.com/office/infopath/2007/PartnerControls">
   <documentManagement>
-    <TaxCatchAll xmlns="cb45339b-ced9-4d0d-8f64-77573914d53b" xsi:nil="true"/>
-    <lcf76f155ced4ddcb4097134ff3c332f xmlns="43a3ca16-9c26-4813-b83f-4aec9927b43f">
+    <TaxCatchAll xmlns="285d351f-f218-493a-825f-85a9dfbde315" xsi:nil="true"/>
+    <lcf76f155ced4ddcb4097134ff3c332f xmlns="55abea07-cd72-4a95-add0-1082a24cf9e9">
       <Terms xmlns="http://schemas.microsoft.com/office/infopath/2007/PartnerControls"/>
     </lcf76f155ced4ddcb4097134ff3c332f>
   </documentManagement>
 </p:properties>
 </file>
 
+<file path=customXml/item4.xml><?xml version="1.0" encoding="utf-8"?>
+<go:gDocsCustomXmlDataStorage xmlns:go="http://customooxmlschemas.google.com/" xmlns:r="http://schemas.openxmlformats.org/officeDocument/2006/relationships">
+  <go:docsCustomData xmlns:go="http://customooxmlschemas.google.com/" roundtripDataSignature="AMtx7mh3w1sXrKwdjzYCxjbwPkf7wsIk5w==">AMUW2mWhRc/xLonLdtoI8dz4BVu2GREgE7++Eme5Ko+W5/2G+QfXPKxV7NwLPPaJ77IM2LrlHDguxVZnDKcg4iQIvJIe+zJ9DBWjUaWFI+z0k4HbdiCFsJo=</go:docsCustomData>
+</go:gDocsCustomXmlDataStorage>
+</file>
+
 <file path=customXml/itemProps1.xml><?xml version="1.0" encoding="utf-8"?>
-<ds:datastoreItem xmlns:ds="http://schemas.openxmlformats.org/officeDocument/2006/customXml" ds:itemID="{11111111-1234-1234-1234-123412341234}">
-  <ds:schemaRefs>
-    <ds:schemaRef ds:uri="http://customooxmlschemas.google.com/"/>
-    <ds:schemaRef ds:uri="http://schemas.openxmlformats.org/officeDocument/2006/relationships"/>
-  </ds:schemaRefs>
-</ds:datastoreItem>
+<ds:datastoreItem xmlns:ds="http://schemas.openxmlformats.org/officeDocument/2006/customXml" ds:itemID="{331E105F-96AF-482B-89DF-4C0AD5A79CAF}"/>
 </file>
 
 <file path=customXml/itemProps2.xml><?xml version="1.0" encoding="utf-8"?>
-<ds:datastoreItem xmlns:ds="http://schemas.openxmlformats.org/officeDocument/2006/customXml" ds:itemID="{0D8D699B-2B67-4D22-9574-492DAFD9C58B}"/>
-</file>
-
-<file path=customXml/itemProps3.xml><?xml version="1.0" encoding="utf-8"?>
 <ds:datastoreItem xmlns:ds="http://schemas.openxmlformats.org/officeDocument/2006/customXml" ds:itemID="{83102ECF-E44F-4F73-A78F-FE313D1BFB9A}">
   <ds:schemaRefs>
     <ds:schemaRef ds:uri="http://schemas.microsoft.com/sharepoint/v3/contenttype/forms"/>
@@ -24875,13 +24851,22 @@
 </ds:datastoreItem>
 </file>
 
-<file path=customXml/itemProps4.xml><?xml version="1.0" encoding="utf-8"?>
+<file path=customXml/itemProps3.xml><?xml version="1.0" encoding="utf-8"?>
 <ds:datastoreItem xmlns:ds="http://schemas.openxmlformats.org/officeDocument/2006/customXml" ds:itemID="{9D9B1A75-0210-4935-8179-95DF20A26AD1}">
   <ds:schemaRefs>
     <ds:schemaRef ds:uri="http://schemas.microsoft.com/office/2006/metadata/properties"/>
     <ds:schemaRef ds:uri="http://schemas.microsoft.com/office/infopath/2007/PartnerControls"/>
-    <ds:schemaRef ds:uri="1d52d4bc-3f95-4709-b359-1b96840d7671"/>
-    <ds:schemaRef ds:uri="8d1bea48-6525-4b05-8cf5-c6ad0dd5b02f"/>
+    <ds:schemaRef ds:uri="cb45339b-ced9-4d0d-8f64-77573914d53b"/>
+    <ds:schemaRef ds:uri="43a3ca16-9c26-4813-b83f-4aec9927b43f"/>
+  </ds:schemaRefs>
+</ds:datastoreItem>
+</file>
+
+<file path=customXml/itemProps4.xml><?xml version="1.0" encoding="utf-8"?>
+<ds:datastoreItem xmlns:ds="http://schemas.openxmlformats.org/officeDocument/2006/customXml" ds:itemID="{11111111-1234-1234-1234-123412341234}">
+  <ds:schemaRefs>
+    <ds:schemaRef ds:uri="http://customooxmlschemas.google.com/"/>
+    <ds:schemaRef ds:uri="http://schemas.openxmlformats.org/officeDocument/2006/relationships"/>
   </ds:schemaRefs>
 </ds:datastoreItem>
 </file>
</xml_diff>